<commit_message>
Cập nhật mẫu CV-Ngân hàng: điền placeholder cho phần Căn cứ
Phần "XÁC NHẬN CỦA NGÂN HÀNG/TỔ CHỨC TÍN DỤNG", dòng "Căn cứ:" trước đây
để trống dấu chấm phải điền tay. Nay dùng {so_gcn_bh}, {gcn_bh_tu_ngay},
{gcn_bh_den_ngay} để tự động điền như phần trên của công văn.

Không cần sửa script: tao_cv_ngan_hang.py đã lấy sẵn 3 trường này từ Excel.

Co-Authored-By: Claude Opus 4.8 <noreply@anthropic.com>
</commit_message>
<xml_diff>
--- a/assets/CV-Ngân hàng.docx
+++ b/assets/CV-Ngân hàng.docx
@@ -1414,7 +1414,56 @@
           <w:szCs w:val="26"/>
         </w:rPr>
         <w:tab/>
-        <w:t>Hợp đồng bảo hiểm số ………….., hiệu lực từ ……đến ………..</w:t>
+        <w:t xml:space="preserve">Hợp đồng bảo hiểm số </w:t>
+      </w:r>
+      <w:r>
+        <w:rPr>
+          <w:sz w:val="25"/>
+          <w:szCs w:val="25"/>
+        </w:rPr>
+        <w:t>{so_gcn_bh}</w:t>
+      </w:r>
+      <w:r>
+        <w:rPr>
+          <w:sz w:val="25"/>
+          <w:szCs w:val="25"/>
+        </w:rPr>
+        <w:t xml:space="preserve">, thời hạn bảo hiểm từ ngày </w:t>
+      </w:r>
+      <w:r>
+        <w:rPr>
+          <w:sz w:val="25"/>
+          <w:szCs w:val="25"/>
+        </w:rPr>
+        <w:t>{</w:t>
+      </w:r>
+      <w:r>
+        <w:rPr>
+          <w:sz w:val="25"/>
+          <w:szCs w:val="25"/>
+        </w:rPr>
+        <w:t>gcn</w:t>
+      </w:r>
+      <w:r>
+        <w:rPr>
+          <w:sz w:val="25"/>
+          <w:szCs w:val="25"/>
+        </w:rPr>
+        <w:t>_bh_tu_ngay} đến ngày {</w:t>
+      </w:r>
+      <w:r>
+        <w:rPr>
+          <w:sz w:val="25"/>
+          <w:szCs w:val="25"/>
+        </w:rPr>
+        <w:t>gcn</w:t>
+      </w:r>
+      <w:r>
+        <w:rPr>
+          <w:sz w:val="25"/>
+          <w:szCs w:val="25"/>
+        </w:rPr>
+        <w:t>_bh_den_ngay}</w:t>
       </w:r>
     </w:p>
     <w:p>
@@ -2138,6 +2187,7 @@
         <w:rPr>
           <w:i/>
         </w:rPr>
+        <w:lastRenderedPageBreak/>
         <w:t xml:space="preserve">Ngân hàng/Tổ chức tín dụng chỉ lựa chọn một trong các phương án bằng việc đánh dấu (x) vào </w:t>
       </w:r>
       <w:r>

</xml_diff>